<commit_message>
Add BAPP Termin 2 (PPL) generator and templates
- Implemented a new script `bapp_ppl_t2.py` to generate BAPP (Berita Acara Pemeriksaan Hasil Pekerjaan) for Termin II based on input Excel data.
- Updated `workflow.py` to include paths for new BAPP Termin 2 input files and document types.
- Modified existing BAPP T1 PPL template to reflect updated personnel information.
- Added new templates for BAPP T2 PML and PPL, including structured placeholders for dynamic data insertion.
</commit_message>
<xml_diff>
--- a/template/01. Template BAPP T1 PPL.docx
+++ b/template/01. Template BAPP T1 PPL.docx
@@ -869,25 +869,7 @@
           <w:sz w:val="24"/>
           <w:szCs w:val="24"/>
         </w:rPr>
-        <w:t xml:space="preserve"> </w:t>
-      </w:r>
-      <w:proofErr w:type="spellStart"/>
-      <w:r>
-        <w:rPr>
-          <w:rFonts w:ascii="Bookman Old Style" w:eastAsia="Bookman Old Style" w:hAnsi="Bookman Old Style" w:cs="Bookman Old Style"/>
-          <w:sz w:val="24"/>
-          <w:szCs w:val="24"/>
-        </w:rPr>
-        <w:t>hal</w:t>
-      </w:r>
-      <w:proofErr w:type="spellEnd"/>
-      <w:r>
-        <w:rPr>
-          <w:rFonts w:ascii="Bookman Old Style" w:eastAsia="Bookman Old Style" w:hAnsi="Bookman Old Style" w:cs="Bookman Old Style"/>
-          <w:sz w:val="24"/>
-          <w:szCs w:val="24"/>
-        </w:rPr>
-        <w:t xml:space="preserve"> </w:t>
+        <w:t xml:space="preserve"> hal </w:t>
       </w:r>
       <w:proofErr w:type="spellStart"/>
       <w:r>
@@ -973,7 +955,16 @@
           <w:sz w:val="24"/>
           <w:szCs w:val="24"/>
         </w:rPr>
-        <w:t>Luke Chiang, SST</w:t>
+        <w:t>Arash Buana</w:t>
+      </w:r>
+      <w:r>
+        <w:rPr>
+          <w:rFonts w:ascii="Bookman Old Style" w:eastAsia="Bookman Old Style" w:hAnsi="Bookman Old Style" w:cs="Bookman Old Style"/>
+          <w:color w:val="1F497D" w:themeColor="text2"/>
+          <w:sz w:val="24"/>
+          <w:szCs w:val="24"/>
+        </w:rPr>
+        <w:t>, SST</w:t>
       </w:r>
     </w:p>
     <w:p>
@@ -3854,16 +3845,7 @@
                 <w:sz w:val="24"/>
                 <w:szCs w:val="24"/>
               </w:rPr>
-              <w:t>Keenan DSA</w:t>
-            </w:r>
-            <w:r>
-              <w:rPr>
-                <w:rFonts w:ascii="Bookman Old Style" w:eastAsia="Bookman Old Style" w:hAnsi="Bookman Old Style" w:cs="Bookman Old Style"/>
-                <w:color w:val="1F497D" w:themeColor="text2"/>
-                <w:sz w:val="24"/>
-                <w:szCs w:val="24"/>
-              </w:rPr>
-              <w:t>, SST</w:t>
+              <w:t>Keenan DSA, SST</w:t>
             </w:r>
           </w:p>
         </w:tc>
@@ -4024,7 +4006,16 @@
           <w:sz w:val="24"/>
           <w:szCs w:val="24"/>
         </w:rPr>
-        <w:t>Luke Chiang, SST</w:t>
+        <w:t>Arash Buana</w:t>
+      </w:r>
+      <w:r>
+        <w:rPr>
+          <w:rFonts w:ascii="Bookman Old Style" w:eastAsia="Bookman Old Style" w:hAnsi="Bookman Old Style" w:cs="Bookman Old Style"/>
+          <w:color w:val="1F497D" w:themeColor="text2"/>
+          <w:sz w:val="24"/>
+          <w:szCs w:val="24"/>
+        </w:rPr>
+        <w:t>, SST</w:t>
       </w:r>
     </w:p>
     <w:p>
@@ -4135,13 +4126,6 @@
           <w:szCs w:val="24"/>
         </w:rPr>
         <w:tab/>
-      </w:r>
-      <w:r>
-        <w:rPr>
-          <w:rFonts w:ascii="Bookman Old Style" w:eastAsia="Bookman Old Style" w:hAnsi="Bookman Old Style" w:cs="Bookman Old Style"/>
-          <w:sz w:val="24"/>
-          <w:szCs w:val="24"/>
-        </w:rPr>
         <w:t xml:space="preserve">NOMOR: </w:t>
       </w:r>
       <w:r>
@@ -6053,7 +6037,16 @@
           <w:sz w:val="24"/>
           <w:szCs w:val="24"/>
         </w:rPr>
-        <w:t>Luke Chiang, SST</w:t>
+        <w:t>Arash Buana</w:t>
+      </w:r>
+      <w:r>
+        <w:rPr>
+          <w:rFonts w:ascii="Bookman Old Style" w:eastAsia="Bookman Old Style" w:hAnsi="Bookman Old Style" w:cs="Bookman Old Style"/>
+          <w:color w:val="1F497D" w:themeColor="text2"/>
+          <w:sz w:val="24"/>
+          <w:szCs w:val="24"/>
+        </w:rPr>
+        <w:t>, SST</w:t>
       </w:r>
     </w:p>
     <w:p>

</xml_diff>